<commit_message>
Furniture: grey footer with left text and a centred page number; 1.5 cm side margins; tables and the header and footer at the full text width on every page
The template's footer: text lines left, the number centred in a grey box, the rule above it grey. Side margins 1.5 cm (18 cm of text). doc.table scales its columns to fill the text width. Every added section gets its own copy of the header and footer, re-related images included, so the landscape pages carry them at the page's own width.

Co-Authored-By: Claude Fable 5.1 <noreply@anthropic.com>
</commit_message>
<xml_diff>
--- a/W16/report/template/Renardet_A4.docx
+++ b/W16/report/template/Renardet_A4.docx
@@ -1144,7 +1144,7 @@
       <w:footerReference w:type="default" r:id="rId13"/>
       <w:type w:val="continuous"/>
       <w:pgSz w:w="11906" w:h="16838" w:code="9"/>
-      <w:pgMar w:top="1440" w:right="1440" w:bottom="1440" w:left="1440" w:header="720" w:footer="144" w:gutter="0"/>
+      <w:pgMar w:top="1440" w:right="850" w:bottom="1247" w:left="850" w:header="720" w:footer="144" w:gutter="0"/>
       <w:cols w:space="720"/>
       <w:titlePg/>
       <w:docGrid w:linePitch="360"/>
@@ -1188,7 +1188,7 @@
       <w:tblStyle w:val="TableGrid"/>
       <w:tblW w:w="5000" w:type="pct"/>
       <w:tblBorders>
-        <w:top w:val="single" w:sz="18" w:space="0" w:color="548DD4" w:themeColor="text2" w:themeTint="99"/>
+        <w:top w:val="single" w:sz="12" w:space="0" w:color="BFBFBF"/>
         <w:left w:val="none" w:sz="0" w:space="0" w:color="auto"/>
         <w:bottom w:val="none" w:sz="0" w:space="0" w:color="auto"/>
         <w:right w:val="none" w:sz="0" w:space="0" w:color="auto"/>
@@ -1209,7 +1209,7 @@
         <w:tcPr>
           <w:tcW w:w="4675" w:type="pct"/>
           <w:tcBorders>
-            <w:top w:val="single" w:sz="4" w:space="0" w:color="auto"/>
+            <w:top w:val="single" w:sz="4" w:space="0" w:color="BFBFBF"/>
           </w:tcBorders>
         </w:tcPr>
         <w:p>
@@ -1221,6 +1221,7 @@
             <w:rPr>
               <w:sz w:val="16"/>
             </w:rPr>
+            <w:jc w:val="left"/>
           </w:pPr>
           <w:r>
             <w:rPr>
@@ -1240,6 +1241,7 @@
               <w:i/>
               <w:sz w:val="16"/>
             </w:rPr>
+            <w:jc w:val="left"/>
           </w:pPr>
           <w:r>
             <w:rPr>
@@ -1262,6 +1264,7 @@
               <w:sz w:val="16"/>
               <w:highlight w:val="red"/>
             </w:rPr>
+            <w:jc w:val="left"/>
           </w:pPr>
           <w:r>
             <w:rPr>
@@ -1285,18 +1288,19 @@
         <w:tcPr>
           <w:tcW w:w="325" w:type="pct"/>
           <w:tcBorders>
-            <w:top w:val="single" w:sz="4" w:space="0" w:color="auto"/>
+            <w:top w:val="single" w:sz="4" w:space="0" w:color="BFBFBF"/>
           </w:tcBorders>
-          <w:shd w:val="clear" w:color="auto" w:fill="000000" w:themeFill="text1"/>
+          <w:shd w:val="clear" w:color="auto" w:fill="7F7F7F"/>
+          <w:vAlign w:val="center"/>
         </w:tcPr>
         <w:p>
           <w:pPr>
             <w:pStyle w:val="Footer"/>
-            <w:jc w:val="center"/>
             <w:rPr>
               <w:sz w:val="20"/>
               <w:szCs w:val="20"/>
             </w:rPr>
+            <w:jc w:val="center"/>
           </w:pPr>
           <w:r>
             <w:rPr>

</xml_diff>